<commit_message>
Restore weighted data and re-render manuscript outputs
data/cueEnergyDataWeighted.csv was untracked in June; restored from
commit fcc606bb so the manuscript setup script can load it. Re-rendered
all three output formats (PDF, HTML, DOCX).

Co-Authored-By: Claude Sonnet 4.6 <noreply@anthropic.com>
</commit_message>
<xml_diff>
--- a/_output/cue-energy.docx
+++ b/_output/cue-energy.docx
@@ -24,7 +24,7 @@
         <w:pStyle w:val="FirstParagraph"/>
       </w:pPr>
       <w:r>
-        <w:t xml:space="preserve">Mitigating climate change requires a significant shift away from fossil fuels toward alternative energy sources, such as renewables and nuclear energy. The energy transition requires action from all sectors of society, including governments. Public policy can guide the move away from fossil fuels, yet policy actions require sufficient public support. Public opinion can influence energy policy by incentivizing policymakers through support for clean energy, voting for candidates that advocate for clean energy, and supporting renewable energy projects in their community</w:t>
+        <w:t xml:space="preserve">Mitigating against climate change requires a significant shift away from fossil fuels toward alternative energy sources, such as renewables and nuclear energy. The energy transition requires action from all sectors of society, including governments. Public policy can guide the move away from fossil fuels, yet policy actions require sufficient public support. Public opinion can influence energy policy by incentivizing policymakers through support for clean energy, voting for candidates that advocate for clean energy, and supporting renewable energy projects in their community</w:t>
       </w:r>
       <w:r>
         <w:t xml:space="preserve"> </w:t>
@@ -50,13 +50,13 @@
         <w:t xml:space="preserve">(Dunlap, McCright, and Yarosh 2016; Egan and Mullin 2024; Hawes and Nowlin 2022)</w:t>
       </w:r>
       <w:r>
-        <w:t xml:space="preserve">. While views on climate change are extremely polarized among the US public, support for expanding renewable energy sources, such as wind and solar, has been generally strong in the last several years and less polarized than climate change</w:t>
-      </w:r>
-      <w:r>
-        <w:t xml:space="preserve"> </w:t>
-      </w:r>
-      <w:r>
-        <w:t xml:space="preserve">(Crowe 2020; Ter-Mkrtchyan et al. 2022)</w:t>
+        <w:t xml:space="preserve">. While views on climate change are extremely polarized among the US public, support for expanding renewable energy sources, such as wind and solar, has been generally strong in the last several years</w:t>
+      </w:r>
+      <w:r>
+        <w:t xml:space="preserve"> </w:t>
+      </w:r>
+      <w:r>
+        <w:t xml:space="preserve">(Bergquist, Konisky, and Kotcher 2020; Crowe 2020; Gustafson et al. 2020; Ter-Mkrtchyan et al. 2022)</w:t>
       </w:r>
       <w:r>
         <w:t xml:space="preserve">.</w:t>
@@ -67,7 +67,7 @@
         <w:pStyle w:val="BodyText"/>
       </w:pPr>
       <w:r>
-        <w:t xml:space="preserve">Yet, this may be changing, with support for renewable energy becoming more polarized. Recent survey data from the Pew Research Center show that support for expanding renewable energy among Republicans has declined, from 65 percent in 2020 to 28 percent in 2026, while at the same time, support for expanding fossil fuels increased from 35 percent in 2020 to 71 percent in 2026 among Republicans</w:t>
+        <w:t xml:space="preserve">Yet, this may be changing, with views about fossil fuels and renewable energy sources becoming more polarized. Recent survey data from the Pew Research Center show that support for expanding renewable energy among Republicans has declined, from 65 percent in 2020 to 28 percent in 2026, while at the same time, support for expanding fossil fuels increased from 35 percent in 2020 to 71 percent in 2026 among Republicans</w:t>
       </w:r>
       <w:r>
         <w:t xml:space="preserve"> </w:t>
@@ -76,7 +76,7 @@
         <w:t xml:space="preserve">(Kennedy and Kikuchi 2026)</w:t>
       </w:r>
       <w:r>
-        <w:t xml:space="preserve">. In this paper, I examine two possible mechanisms that could account for the shift among Republicans, including framing that connects renewable energy to climate change or cues from prominent Republicans, most notably Donald Trump.</w:t>
+        <w:t xml:space="preserve">. In this paper, I examine two possible mechanisms that could account for the shift among Republicans, including cues that connects renewable energy to climate change or cues from prominent Republicans, most notably Donald Trump.</w:t>
       </w:r>
     </w:p>
     <w:p>
@@ -84,15 +84,7 @@
         <w:pStyle w:val="BodyText"/>
       </w:pPr>
       <w:r>
-        <w:t xml:space="preserve">Donald Trump may serve to politicize energy</w:t>
-      </w:r>
-    </w:p>
-    <w:p>
-      <w:pPr>
-        <w:pStyle w:val="BodyText"/>
-      </w:pPr>
-      <w:r>
-        <w:t xml:space="preserve">The purpose of the study is to examine how partisan or climate change cues could shift the general public’s preferred energy mix for electricity production.</w:t>
+        <w:t xml:space="preserve">Using a survey experiment, I test a set of preregistered hypotheses to examine if partisan or climate change cues could shift the general public’s preferred energy mix for electricity production. Respondents were given information about the current energy mix for electricity in the US, then they were either given a cue about Trump’s support/opposition to fossil fuels/renewables, a cue about the need to increase the use of renewables to address climate change, or placed in a control group with no cues. Overall, I find that conservative Republicans were responsive to the Trump cue, preferring more fossil fuels and less renewables than those in who received the climate cue or no cue, but they were not responsive to the climate cue. Liberal Democrats were generally less responsive to either cue than Republicans. Additionally, the Trump cue served to polarization views about fossil fuels, largely based on the shift among conservative Republicans. Finally, all respondents preferred an energy mix that has fewer fossil fuels and more renewables for electricity production than the current US mix.</w:t>
       </w:r>
     </w:p>
     <w:bookmarkEnd w:id="9"/>
@@ -157,7 +149,7 @@
         <w:t xml:space="preserve"> </w:t>
       </w:r>
       <w:r>
-        <w:t xml:space="preserve">and more concerned about extraction processes associated with oil and gas, such as hydraulic fracturing, or</w:t>
+        <w:t xml:space="preserve">and more concerned about the extraction processes associated with oil and gas, such as hydraulic fracturing, or</w:t>
       </w:r>
       <w:r>
         <w:t xml:space="preserve"> </w:t>
@@ -288,7 +280,7 @@
         <w:pStyle w:val="BodyText"/>
       </w:pPr>
       <w:r>
-        <w:t xml:space="preserve">As noted, recent public surveys indicate that support among Republicans for renewables is falling while support for fossil fuels is increasing. One reason for this trend may be that renewable energy has become entangled with climate change, leading Republicans to be less supportive. For example, support for renewable energy policy declined among conservatives with that policy was paired with a carbon capture and storage climate policy</w:t>
+        <w:t xml:space="preserve">As noted, recent public surveys indicate that support among Republicans for renewables is falling while support for fossil fuels is increasing. One reason for this trend may be that renewable energy has become entangled with climate change, leading Republicans to be less supportive. For example, support for renewable energy policy declined among conservatives when that policy was paired with a carbon capture and storage climate policy</w:t>
       </w:r>
       <w:r>
         <w:t xml:space="preserve"> </w:t>
@@ -297,7 +289,7 @@
         <w:t xml:space="preserve">(Marlow and Makovi 2023)</w:t>
       </w:r>
       <w:r>
-        <w:t xml:space="preserve">. Therefore, if renewables are framed as an approach to address climate change, which causes a climate cue, the use of renewables is likely to become more polarized. Framing entails focusing on one or more aspects of an issue, which can shape how that issue is viewed and understood. How climate policies are framed, such as science, moral, and economic frames can lead to more (less) support for those policies</w:t>
+        <w:t xml:space="preserve">. Therefore, if renewables are framed as an approach to address climate change, which causes a cue that connects renewables to climate change, support for the use of renewables is likely to become more polarized. Framing entails focusing on one or more aspects of an issue, which can shape how that issue is viewed and understood. How climate policies are framed, such as science, moral, and economic frames can lead to more (less) support for those policies</w:t>
       </w:r>
       <w:r>
         <w:t xml:space="preserve">(Severson and Coleman 2015)</w:t>
@@ -329,7 +321,7 @@
         <w:pStyle w:val="BodyText"/>
       </w:pPr>
       <w:r>
-        <w:t xml:space="preserve">The importance of framing in shaping public opinion in studies that have found that a climate change frame can influence views on energy. For example, one study found that Republicans were less supportive of a carbon tax, fuel efficiency, and renewables when they were framed as a way to address climate change compared to being framed as a way to address air pollution or energy security</w:t>
+        <w:t xml:space="preserve">The importance of framing in shaping public opinion in studies that have found that a climate change cue can influence views on energy. For example, one study found that Republicans were less supportive of a carbon tax, fuel efficiency, and renewables when they were framed as a way to address climate change compared to being framed as a way to address air pollution or energy security</w:t>
       </w:r>
       <w:r>
         <w:t xml:space="preserve"> </w:t>
@@ -467,7 +459,7 @@
         <w:pStyle w:val="BodyText"/>
       </w:pPr>
       <w:r>
-        <w:t xml:space="preserve">No political figure in the last decade, or more, has done more to polarization the public than President Trump. The</w:t>
+        <w:t xml:space="preserve">No political figure in the last decade, or more, has done more to polarize the public than President Trump. The</w:t>
       </w:r>
       <w:r>
         <w:t xml:space="preserve"> </w:t>
@@ -509,7 +501,16 @@
         <w:t xml:space="preserve">(Gerrard 2025; Joselow and Washington 2025)</w:t>
       </w:r>
       <w:r>
-        <w:t xml:space="preserve">. Such actions are likely to polarize the public further on energy issues.</w:t>
+        <w:t xml:space="preserve">. Such actions are likely to polarize the public further on energy issues. Indeed, recent work suggest that Presidents can serve as key elites in driving polarization on climate change</w:t>
+      </w:r>
+      <w:r>
+        <w:t xml:space="preserve"> </w:t>
+      </w:r>
+      <w:r>
+        <w:t xml:space="preserve">(Childree 2026)</w:t>
+      </w:r>
+      <w:r>
+        <w:t xml:space="preserve">.</w:t>
       </w:r>
     </w:p>
     <w:bookmarkStart w:id="11" w:name="hypotheses"/>
@@ -526,7 +527,7 @@
         <w:pStyle w:val="FirstParagraph"/>
       </w:pPr>
       <w:r>
-        <w:t xml:space="preserve">The observed growing polarization on energy issues, most notably fossil fuels and renewables, could be a result of a climate change frame associated with those energy sources and/or a result of elite cues, particularly from President Trump, regarding those energy sources. To examine these possibilities, I posit the following hypotheses regarding the impacts of climate and partisan cues on the preferred energy mix of fossil fuels and renewable energy sources on the public.</w:t>
+        <w:t xml:space="preserve">The observed growing polarization on energy issues, most notably fossil fuels and renewables, could be a result of a climate change cue associated with those energy sources and/or a result of elite cues, particularly from President Trump, regarding those energy sources. To examine these possibilities, I posit the following hypotheses regarding the impacts of climate and partisan cues on the preferred energy mix of fossil fuels and renewable energy sources on the public.</w:t>
       </w:r>
       <w:r>
         <w:rPr>
@@ -538,7 +539,7 @@
         <w:t xml:space="preserve"> </w:t>
       </w:r>
       <w:r>
-        <w:t xml:space="preserve">Generally, I expect that the cues will move co-partisans more in the direction of the party’s position and have a backlash effect on out-partisans, moving them further away from the out-party’s position. Given that nuclear energy is not as central as fossil fuels and renewable sources to the current climate debate or Trump’s actions on energy, I do not have any expectations regarding the impacts of the cues on nuclear energy use.</w:t>
+        <w:t xml:space="preserve">Generally, I expect that the cues will move co-partisans more in the direction of the party’s position and have a backlash effect on out-partisans, moving them further away from the out-party’s position. Given that nuclear energy is not as polarized or as central as fossil fuels and renewable sources to the current climate debate or Trump’s actions on energy, I do not have any expectations regarding the impacts of the cues on nuclear energy use.</w:t>
       </w:r>
     </w:p>
     <w:p>
@@ -804,7 +805,7 @@
         <w:t xml:space="preserve">Information</w:t>
       </w:r>
       <w:r>
-        <w:t xml:space="preserve">: As part of the research design, respondents were first given the current energy mix, as of 2024, of the US related to electricity. Therefore, respondents were anchored to the actual energy mix use to produce electricity in the US, as of 2024 the most recent year where data was available.</w:t>
+        <w:t xml:space="preserve">: As part of the research design, respondents were first given the current energy mix, as of 2024 the most recent year where data was available, of the US related to electricity. Therefore, respondents were anchored to the actual energy mix used to produce electricity in the US.</w:t>
       </w:r>
     </w:p>
     <w:p>
@@ -4839,7 +4840,7 @@
                       <w:szCs w:val="14"/>
                       <w:color w:val="000000"/>
                     </w:rPr>
-                    <w:t xml:space="preserve">Note: Cell entries are estimated differences in the predicted preferred share (percentage points) underlying Figure 2. Partisan-gap rows are the Liberal Democrats − Conservative Republicans difference within each condition; within-party rows are the change for that party when moving from one condition to another. Estimates use survey weights; standard errors and p-values are design-based. *** p &lt; 0.001, ** p &lt; 0.01, * p &lt; 0.05, † p &lt; 0.10.</w:t>
+                    <w:t xml:space="preserve">Note: Cell entries are estimated differences in the predicted preferred share (percentage points) underlying Figure 2. Partisan-gap rows are the Liberal Democrats − Conservative Republicans difference within each condition; within-party rows are the change for that party when moving from one condition to another (positive = the later condition is higher). Estimates use survey weights; standard errors and p-values are design-based. *** p &lt; 0.001, ** p &lt; 0.01, * p &lt; 0.05, † p &lt; 0.10.</w:t>
                   </w:r>
                 </w:p>
               </w:tc>
@@ -6725,7 +6726,7 @@
                       <w:szCs w:val="14"/>
                       <w:color w:val="000000"/>
                     </w:rPr>
-                    <w:t xml:space="preserve">Note: Top row shows the omnibus F-test for whether treatments jointly shift the partisan gap on each energy source. Subsequent rows show the estimated change in the partisan gap (Liberal Democrats − Conservative Republicans) when moving from one treatment condition to another, with 95% confidence intervals in brackets. Estimates from svyglm models fit separately by energy source, using survey weights; standard errors and confidence intervals are design-based. *** p &lt; 0.001, ** p &lt; 0.01, * p &lt; 0.05, † p &lt; 0.10.</w:t>
+                    <w:t xml:space="preserve">Note: Top row shows the omnibus F-test for whether treatments jointly shift the partisan gap on each energy source. Subsequent rows show the estimated change in the partisan gap (Liberal Democrats − Conservative Republicans) when moving from one treatment condition to another, with 95% confidence intervals in brackets. Positive values indicate the gap widened. Estimates from svyglm models fit separately by energy source, using survey weights; standard errors and confidence intervals are design-based. *** p &lt; 0.001, ** p &lt; 0.01, * p &lt; 0.05, † p &lt; 0.10.</w:t>
                   </w:r>
                 </w:p>
               </w:tc>
@@ -7025,13 +7026,7 @@
         <w:pStyle w:val="BodyText"/>
       </w:pPr>
       <w:r>
-        <w:t xml:space="preserve">Overall, these results suggest that the Trump effect is the most likely explanation for the Republican shift on fossil fuels and renewable energy.</w:t>
-      </w:r>
-      <w:r>
-        <w:t xml:space="preserve"> </w:t>
-      </w:r>
-      <w:r>
-        <w:t xml:space="preserve">Democrats were not as responsive to cues as Republicans, although they did prefer less use of fossil fuels in climate condition compared to the Trump condition and slighly more hydro power in the climate condition compared to the control. In general, Trump seems to have execarbated some existing polarization, particularly on fossil fuels, rather than creating polarization where none had existed before. Additionally, respondents of all political beliefs across all conditions, anchored by information regarding the current US energy mix, preferred fewer fossil fuels and more renewable sources of energy for the production of electricity. Finally, there was limited evidence for the expected backlash effects. Compared to the control, Republicans in the climate condition saw no shifts in support for fossil fuels or opposition to renewables. Simarly, Democrats in the Trump condition did not support fossil fuels less or renewables more in the Trump condition. In fact, Democrats preferred</w:t>
+        <w:t xml:space="preserve">Overall, these results suggest that the Trump effect is the most likely explanation for the Republican shift on fossil fuels and renewable energy. Democrats were not as responsive to cues as Republicans, although they did prefer less use of fossil fuels in climate condition compared to the Trump condition and slighly more hydro power in the climate condition compared to the control. In general, Trump seems to have execarbated some existing polarization, particularly on fossil fuels, rather than creating polarization where none had existed before. Additionally, respondents of all political beliefs across all conditions, anchored by information regarding the current US energy mix, preferred fewer fossil fuels and more renewable sources of energy for the production of electricity. Finally, there was limited evidence for the expected backlash effects. Compared to the control, Republicans in the climate condition saw no shifts in support for fossil fuels or opposition to renewables. Simarly, Democrats in the Trump condition did not support fossil fuels less or renewables more in the Trump condition. In fact, Democrats preferred</w:t>
       </w:r>
       <w:r>
         <w:t xml:space="preserve"> </w:t>
@@ -7081,7 +7076,15 @@
         <w:pStyle w:val="FirstParagraph"/>
       </w:pPr>
       <w:r>
-        <w:t xml:space="preserve">Addressing and limiting the impacts of a changing climate require transitioning away from fossil fuels as a primary energy source.</w:t>
+        <w:t xml:space="preserve">Addressing and limiting the impacts of a changing climate require transitioning away from fossil fuels as a primary energy source. In general, the US public is supportive of the energy transition even as climate change remains polarized. However, support for fossil fuels and opposition to renewables has increased among Republicans over the last decade.</w:t>
+      </w:r>
+    </w:p>
+    <w:p>
+      <w:pPr>
+        <w:pStyle w:val="BodyText"/>
+      </w:pPr>
+      <w:r>
+        <w:t xml:space="preserve">Using a survey experiment, I found that the Trump effect was the most likely cause of the shift on energy among Republicans. Trump has long indicated his support for fossil fuels and his opposition to renewables. Since taking office for the second time he has aggresively sought to limit the development of renewables sources of energy. These actions have likely served to further polarize support for various sources of energy, particularly for conservative Republicans and fossil fuels. Despite this increased polarization, the US public still seems to prefer an energy mix with more renewables and less fossil fuels.</w:t>
       </w:r>
     </w:p>
     <w:p>
@@ -7090,7 +7093,7 @@
       </w:r>
     </w:p>
     <w:bookmarkEnd w:id="38"/>
-    <w:bookmarkStart w:id="85" w:name="references"/>
+    <w:bookmarkStart w:id="86" w:name="references"/>
     <w:p>
       <w:pPr>
         <w:pStyle w:val="Heading1"/>
@@ -7099,7 +7102,7 @@
         <w:t xml:space="preserve">References</w:t>
       </w:r>
     </w:p>
-    <w:bookmarkStart w:id="84" w:name="refs"/>
+    <w:bookmarkStart w:id="85" w:name="refs"/>
     <w:bookmarkStart w:id="39" w:name="ref-aklinDebatingCleanEnergy2013"/>
     <w:p>
       <w:pPr>
@@ -7362,7 +7365,7 @@
         <w:t xml:space="preserve"> </w:t>
       </w:r>
       <w:r>
-        <w:t xml:space="preserve">64(2): 498–557.</w:t>
+        <w:t xml:space="preserve">64(2): 498–557. https://pubs.aeaweb.org/doi/10.1257/jel.20251650 (June 14, 2026).</w:t>
       </w:r>
     </w:p>
     <w:bookmarkEnd w:id="41"/>
@@ -7445,7 +7448,7 @@
         <w:t xml:space="preserve"> </w:t>
       </w:r>
       <w:r>
-        <w:t xml:space="preserve">2(3): 032003.</w:t>
+        <w:t xml:space="preserve">2(3): 032003. https://doi.org/10.1088/2516-1083/ab9592 (September 29, 2025).</w:t>
       </w:r>
     </w:p>
     <w:bookmarkEnd w:id="42"/>
@@ -7553,7 +7556,93 @@
       </w:r>
     </w:p>
     <w:bookmarkEnd w:id="43"/>
-    <w:bookmarkStart w:id="44" w:name="Xebf368cafe554979714668cfecf3730e40614f9"/>
+    <w:bookmarkStart w:id="44" w:name="Xe2f60b19880ed838481f3c35ad0ea337658d4d1"/>
+    <w:p>
+      <w:pPr>
+        <w:pStyle w:val="Bibliography"/>
+      </w:pPr>
+      <w:r>
+        <w:t xml:space="preserve">Childree, Aaron. 2026.</w:t>
+      </w:r>
+      <w:r>
+        <w:t xml:space="preserve"> </w:t>
+      </w:r>
+      <w:r>
+        <w:t xml:space="preserve">“Polarizing</w:t>
+      </w:r>
+      <w:r>
+        <w:t xml:space="preserve"> </w:t>
+      </w:r>
+      <w:r>
+        <w:t xml:space="preserve">Figures</w:t>
+      </w:r>
+      <w:r>
+        <w:t xml:space="preserve"> </w:t>
+      </w:r>
+      <w:r>
+        <w:t xml:space="preserve">in</w:t>
+      </w:r>
+      <w:r>
+        <w:t xml:space="preserve"> </w:t>
+      </w:r>
+      <w:r>
+        <w:t xml:space="preserve">Polarized Times</w:t>
+      </w:r>
+      <w:r>
+        <w:t xml:space="preserve">:</w:t>
+      </w:r>
+      <w:r>
+        <w:t xml:space="preserve"> </w:t>
+      </w:r>
+      <w:r>
+        <w:t xml:space="preserve">Presidential Involvement</w:t>
+      </w:r>
+      <w:r>
+        <w:t xml:space="preserve"> </w:t>
+      </w:r>
+      <w:r>
+        <w:t xml:space="preserve">and</w:t>
+      </w:r>
+      <w:r>
+        <w:t xml:space="preserve"> </w:t>
+      </w:r>
+      <w:r>
+        <w:t xml:space="preserve">Public Opinion</w:t>
+      </w:r>
+      <w:r>
+        <w:t xml:space="preserve"> </w:t>
+      </w:r>
+      <w:r>
+        <w:t xml:space="preserve">on</w:t>
+      </w:r>
+      <w:r>
+        <w:t xml:space="preserve"> </w:t>
+      </w:r>
+      <w:r>
+        <w:t xml:space="preserve">Climate Policy</w:t>
+      </w:r>
+      <w:r>
+        <w:t xml:space="preserve">.”</w:t>
+      </w:r>
+      <w:r>
+        <w:t xml:space="preserve"> </w:t>
+      </w:r>
+      <w:r>
+        <w:rPr>
+          <w:i/>
+          <w:iCs/>
+        </w:rPr>
+        <w:t xml:space="preserve">Environmental Politics</w:t>
+      </w:r>
+      <w:r>
+        <w:t xml:space="preserve"> </w:t>
+      </w:r>
+      <w:r>
+        <w:t xml:space="preserve">(0): 1–32. https://doi.org/10.1080/09644016.2026.2666997 (June 2, 2026).</w:t>
+      </w:r>
+    </w:p>
+    <w:bookmarkEnd w:id="44"/>
+    <w:bookmarkStart w:id="45" w:name="Xebf368cafe554979714668cfecf3730e40614f9"/>
     <w:p>
       <w:pPr>
         <w:pStyle w:val="Bibliography"/>
@@ -7650,8 +7739,8 @@
         <w:t xml:space="preserve">51: 156–67.</w:t>
       </w:r>
     </w:p>
-    <w:bookmarkEnd w:id="44"/>
-    <w:bookmarkStart w:id="45" w:name="ref-croweEffectPartisanCues2020"/>
+    <w:bookmarkEnd w:id="45"/>
+    <w:bookmarkStart w:id="46" w:name="ref-croweEffectPartisanCues2020"/>
     <w:p>
       <w:pPr>
         <w:pStyle w:val="Bibliography"/>
@@ -7748,11 +7837,11 @@
         <w:t xml:space="preserve"> </w:t>
       </w:r>
       <w:r>
-        <w:t xml:space="preserve">101(4): 1461–74.</w:t>
-      </w:r>
-    </w:p>
-    <w:bookmarkEnd w:id="45"/>
-    <w:bookmarkStart w:id="46" w:name="X27179e39f52caa689f22cc3347e1f866f47b9b7"/>
+        <w:t xml:space="preserve">101(4): 1461–74. https://onlinelibrary.wiley.com/doi/abs/10.1111/ssqu.12799 (September 27, 2025).</w:t>
+      </w:r>
+    </w:p>
+    <w:bookmarkEnd w:id="46"/>
+    <w:bookmarkStart w:id="47" w:name="X27179e39f52caa689f22cc3347e1f866f47b9b7"/>
     <w:p>
       <w:pPr>
         <w:pStyle w:val="Bibliography"/>
@@ -7834,11 +7923,11 @@
         <w:t xml:space="preserve"> </w:t>
       </w:r>
       <w:r>
-        <w:t xml:space="preserve">31(1): 1–16.</w:t>
-      </w:r>
-    </w:p>
-    <w:bookmarkEnd w:id="46"/>
-    <w:bookmarkStart w:id="47" w:name="X1c152469eab8dc86eeea4ab94fdfc8ef1ce9dfe"/>
+        <w:t xml:space="preserve">31(1): 1–16. https://onlinelibrary.wiley.com/doi/abs/10.1111/ropr.12048 (June 4, 2026).</w:t>
+      </w:r>
+    </w:p>
+    <w:bookmarkEnd w:id="47"/>
+    <w:bookmarkStart w:id="48" w:name="X1c152469eab8dc86eeea4ab94fdfc8ef1ce9dfe"/>
     <w:p>
       <w:pPr>
         <w:pStyle w:val="Bibliography"/>
@@ -7899,11 +7988,11 @@
         <w:t xml:space="preserve"> </w:t>
       </w:r>
       <w:r>
-        <w:t xml:space="preserve">9(2): 111–19.</w:t>
-      </w:r>
-    </w:p>
-    <w:bookmarkEnd w:id="47"/>
-    <w:bookmarkStart w:id="48" w:name="ref-dunlapWideningGapRepublican2008"/>
+        <w:t xml:space="preserve">9(2): 111–19. https://www.nature.com/articles/s41558-018-0360-1 (August 18, 2023).</w:t>
+      </w:r>
+    </w:p>
+    <w:bookmarkEnd w:id="48"/>
+    <w:bookmarkStart w:id="49" w:name="ref-dunlapWideningGapRepublican2008"/>
     <w:p>
       <w:pPr>
         <w:pStyle w:val="Bibliography"/>
@@ -7976,8 +8065,8 @@
         <w:t xml:space="preserve">50(5): 26–35.</w:t>
       </w:r>
     </w:p>
-    <w:bookmarkEnd w:id="48"/>
-    <w:bookmarkStart w:id="49" w:name="ref-dunlapPoliticalDivideClimate2016"/>
+    <w:bookmarkEnd w:id="49"/>
+    <w:bookmarkStart w:id="50" w:name="ref-dunlapPoliticalDivideClimate2016"/>
     <w:p>
       <w:pPr>
         <w:pStyle w:val="Bibliography"/>
@@ -8056,8 +8145,8 @@
         <w:t xml:space="preserve">58(5): 4–23.</w:t>
       </w:r>
     </w:p>
-    <w:bookmarkEnd w:id="49"/>
-    <w:bookmarkStart w:id="50" w:name="ref-eganUSPartisanPolarization2024"/>
+    <w:bookmarkEnd w:id="50"/>
+    <w:bookmarkStart w:id="51" w:name="ref-eganUSPartisanPolarization2024"/>
     <w:p>
       <w:pPr>
         <w:pStyle w:val="Bibliography"/>
@@ -8124,11 +8213,11 @@
         <w:t xml:space="preserve"> </w:t>
       </w:r>
       <w:r>
-        <w:t xml:space="preserve">57(1): 30–35.</w:t>
-      </w:r>
-    </w:p>
-    <w:bookmarkEnd w:id="50"/>
-    <w:bookmarkStart w:id="51" w:name="ref-essigTrumpEffectPolitical2021"/>
+        <w:t xml:space="preserve">57(1): 30–35. https://www.cambridge.org/core/journals/ps-political-science-and-politics/article/us-partisan-polarization-on-climate-change-can-stalemate-give-way-to-opportunity/2666C4C08C3A5456B3001240B882C48D (April 22, 2026).</w:t>
+      </w:r>
+    </w:p>
+    <w:bookmarkEnd w:id="51"/>
+    <w:bookmarkStart w:id="52" w:name="ref-essigTrumpEffectPolitical2021"/>
     <w:p>
       <w:pPr>
         <w:pStyle w:val="Bibliography"/>
@@ -8222,11 +8311,11 @@
         <w:t xml:space="preserve"> </w:t>
       </w:r>
       <w:r>
-        <w:t xml:space="preserve">49(3): 328–42.</w:t>
-      </w:r>
-    </w:p>
-    <w:bookmarkEnd w:id="51"/>
-    <w:bookmarkStart w:id="52" w:name="ref-feldmanClimateChangePolarizing2018"/>
+        <w:t xml:space="preserve">49(3): 328–42. https://doi.org/10.1177/1532673X21992124 (September 27, 2025).</w:t>
+      </w:r>
+    </w:p>
+    <w:bookmarkEnd w:id="52"/>
+    <w:bookmarkStart w:id="53" w:name="ref-feldmanClimateChangePolarizing2018"/>
     <w:p>
       <w:pPr>
         <w:pStyle w:val="Bibliography"/>
@@ -8311,8 +8400,8 @@
         <w:t xml:space="preserve">51: 54–66.</w:t>
       </w:r>
     </w:p>
-    <w:bookmarkEnd w:id="52"/>
-    <w:bookmarkStart w:id="53" w:name="X84270ebadc61ed83cf52cd61afa61cee7262e56"/>
+    <w:bookmarkEnd w:id="53"/>
+    <w:bookmarkStart w:id="54" w:name="X84270ebadc61ed83cf52cd61afa61cee7262e56"/>
     <w:p>
       <w:pPr>
         <w:pStyle w:val="Bibliography"/>
@@ -8361,11 +8450,11 @@
         <w:t xml:space="preserve"> </w:t>
       </w:r>
       <w:r>
-        <w:t xml:space="preserve">35(4): 846–68.</w:t>
-      </w:r>
-    </w:p>
-    <w:bookmarkEnd w:id="53"/>
-    <w:bookmarkStart w:id="54" w:name="ref-gerrardTrumpsMultiProngedAttack2025"/>
+        <w:t xml:space="preserve">35(4): 846–68. https://doi.org/10.1080/09644016.2025.2508563 (October 2, 2025).</w:t>
+      </w:r>
+    </w:p>
+    <w:bookmarkEnd w:id="54"/>
+    <w:bookmarkStart w:id="55" w:name="ref-gerrardTrumpsMultiProngedAttack2025"/>
     <w:p>
       <w:pPr>
         <w:pStyle w:val="Bibliography"/>
@@ -8414,8 +8503,8 @@
         <w:t xml:space="preserve">.</w:t>
       </w:r>
     </w:p>
-    <w:bookmarkEnd w:id="54"/>
-    <w:bookmarkStart w:id="55" w:name="ref-guptaTrackingNuclearMood2019"/>
+    <w:bookmarkEnd w:id="55"/>
+    <w:bookmarkStart w:id="56" w:name="ref-guptaTrackingNuclearMood2019"/>
     <w:p>
       <w:pPr>
         <w:pStyle w:val="Bibliography"/>
@@ -8506,8 +8595,8 @@
         <w:t xml:space="preserve">133.</w:t>
       </w:r>
     </w:p>
-    <w:bookmarkEnd w:id="55"/>
-    <w:bookmarkStart w:id="56" w:name="Xfffb65b6370bfa57249c199162bb375462c420a"/>
+    <w:bookmarkEnd w:id="56"/>
+    <w:bookmarkStart w:id="57" w:name="Xfffb65b6370bfa57249c199162bb375462c420a"/>
     <w:p>
       <w:pPr>
         <w:pStyle w:val="Bibliography"/>
@@ -8589,11 +8678,11 @@
         <w:t xml:space="preserve"> </w:t>
       </w:r>
       <w:r>
-        <w:t xml:space="preserve">7(11): 1023–30.</w:t>
-      </w:r>
-    </w:p>
-    <w:bookmarkEnd w:id="56"/>
-    <w:bookmarkStart w:id="57" w:name="X3dc7f787e182e4dd48e8853dfbac57823334453"/>
+        <w:t xml:space="preserve">7(11): 1023–30. https://www.nature.com/articles/s41560-022-01099-2 (September 27, 2025).</w:t>
+      </w:r>
+    </w:p>
+    <w:bookmarkEnd w:id="57"/>
+    <w:bookmarkStart w:id="58" w:name="X3dc7f787e182e4dd48e8853dfbac57823334453"/>
     <w:p>
       <w:pPr>
         <w:pStyle w:val="Bibliography"/>
@@ -8645,8 +8734,8 @@
         <w:t xml:space="preserve">141: 111448.</w:t>
       </w:r>
     </w:p>
-    <w:bookmarkEnd w:id="57"/>
-    <w:bookmarkStart w:id="58" w:name="X27185224445e8894ff24d837fc80cc72b2208d7"/>
+    <w:bookmarkEnd w:id="58"/>
+    <w:bookmarkStart w:id="59" w:name="X27185224445e8894ff24d837fc80cc72b2208d7"/>
     <w:p>
       <w:pPr>
         <w:pStyle w:val="Bibliography"/>
@@ -8710,8 +8799,8 @@
         <w:t xml:space="preserve">9: 940–44.</w:t>
       </w:r>
     </w:p>
-    <w:bookmarkEnd w:id="58"/>
-    <w:bookmarkStart w:id="59" w:name="ref-hamiltonChangeWindUS2018"/>
+    <w:bookmarkEnd w:id="59"/>
+    <w:bookmarkStart w:id="60" w:name="ref-hamiltonChangeWindUS2018"/>
     <w:p>
       <w:pPr>
         <w:pStyle w:val="Bibliography"/>
@@ -8796,8 +8885,8 @@
         <w:t xml:space="preserve">8(1): 11.</w:t>
       </w:r>
     </w:p>
-    <w:bookmarkEnd w:id="59"/>
-    <w:bookmarkStart w:id="60" w:name="ref-hartPoliticalPolarizationSupport2021"/>
+    <w:bookmarkEnd w:id="60"/>
+    <w:bookmarkStart w:id="61" w:name="ref-hartPoliticalPolarizationSupport2021"/>
     <w:p>
       <w:pPr>
         <w:pStyle w:val="Bibliography"/>
@@ -8858,11 +8947,11 @@
         <w:t xml:space="preserve"> </w:t>
       </w:r>
       <w:r>
-        <w:t xml:space="preserve">150: 112156.</w:t>
-      </w:r>
-    </w:p>
-    <w:bookmarkEnd w:id="60"/>
-    <w:bookmarkStart w:id="61" w:name="ref-hawesClimateSciencePolitics2022"/>
+        <w:t xml:space="preserve">150: 112156. https://linkinghub.elsevier.com/retrieve/pii/S0301421521000252 (June 9, 2026).</w:t>
+      </w:r>
+    </w:p>
+    <w:bookmarkEnd w:id="61"/>
+    <w:bookmarkStart w:id="62" w:name="ref-hawesClimateSciencePolitics2022"/>
     <w:p>
       <w:pPr>
         <w:pStyle w:val="Bibliography"/>
@@ -8980,11 +9069,11 @@
         <w:t xml:space="preserve"> </w:t>
       </w:r>
       <w:r>
-        <w:t xml:space="preserve">85: 102419.</w:t>
-      </w:r>
-    </w:p>
-    <w:bookmarkEnd w:id="61"/>
-    <w:bookmarkStart w:id="62" w:name="ref-howellSeeingRiskColoredGlasses2019"/>
+        <w:t xml:space="preserve">85: 102419. https://www.sciencedirect.com/science/article/abs/pii/S2214629621005065 (November 29, 2021).</w:t>
+      </w:r>
+    </w:p>
+    <w:bookmarkEnd w:id="62"/>
+    <w:bookmarkStart w:id="63" w:name="ref-howellSeeingRiskColoredGlasses2019"/>
     <w:p>
       <w:pPr>
         <w:pStyle w:val="Bibliography"/>
@@ -9087,8 +9176,8 @@
         <w:t xml:space="preserve">55: 168–78.</w:t>
       </w:r>
     </w:p>
-    <w:bookmarkEnd w:id="62"/>
-    <w:bookmarkStart w:id="63" w:name="ref-jeongPolarisationEnergyPolicy2021"/>
+    <w:bookmarkEnd w:id="63"/>
+    <w:bookmarkStart w:id="64" w:name="ref-jeongPolarisationEnergyPolicy2021"/>
     <w:p>
       <w:pPr>
         <w:pStyle w:val="Bibliography"/>
@@ -9149,11 +9238,11 @@
         <w:t xml:space="preserve"> </w:t>
       </w:r>
       <w:r>
-        <w:t xml:space="preserve">41(1): 17–41.</w:t>
-      </w:r>
-    </w:p>
-    <w:bookmarkEnd w:id="63"/>
-    <w:bookmarkStart w:id="64" w:name="ref-joselowHowTrumpsFirst2025"/>
+        <w:t xml:space="preserve">41(1): 17–41. https://www.cambridge.org/core/journals/journal-of-public-policy/article/abs/polarisation-of-energy-policy-in-the-us-congress/0BE468805017440A5B48D30A0171FDCC (November 19, 2025).</w:t>
+      </w:r>
+    </w:p>
+    <w:bookmarkEnd w:id="64"/>
+    <w:bookmarkStart w:id="65" w:name="ref-joselowHowTrumpsFirst2025"/>
     <w:p>
       <w:pPr>
         <w:pStyle w:val="Bibliography"/>
@@ -9226,8 +9315,8 @@
         <w:t xml:space="preserve">. https://www.nytimes.com/2025/12/22/climate/how-trumps-first-year-reshaped-us-energy-and-climate-policy.html (December 22, 2025).</w:t>
       </w:r>
     </w:p>
-    <w:bookmarkEnd w:id="64"/>
-    <w:bookmarkStart w:id="65" w:name="ref-kennedyAmericansShiftingViews2026"/>
+    <w:bookmarkEnd w:id="65"/>
+    <w:bookmarkStart w:id="66" w:name="ref-kennedyAmericansShiftingViews2026"/>
     <w:p>
       <w:pPr>
         <w:pStyle w:val="Bibliography"/>
@@ -9281,8 +9370,8 @@
         <w:t xml:space="preserve">https://www.pewresearch.org/science/2026/04/03/americans-shifting-views-on-energy-issues/ (April 21, 2026).</w:t>
       </w:r>
     </w:p>
-    <w:bookmarkEnd w:id="65"/>
-    <w:bookmarkStart w:id="66" w:name="ref-krosnickImpactFall19972000"/>
+    <w:bookmarkEnd w:id="66"/>
+    <w:bookmarkStart w:id="67" w:name="ref-krosnickImpactFall19972000"/>
     <w:p>
       <w:pPr>
         <w:pStyle w:val="Bibliography"/>
@@ -9358,8 +9447,8 @@
         <w:t xml:space="preserve">9(3): 239–60.</w:t>
       </w:r>
     </w:p>
-    <w:bookmarkEnd w:id="66"/>
-    <w:bookmarkStart w:id="67" w:name="ref-lowryDisentanglingEnergyPolicy2008"/>
+    <w:bookmarkEnd w:id="67"/>
+    <w:bookmarkStart w:id="68" w:name="ref-lowryDisentanglingEnergyPolicy2008"/>
     <w:p>
       <w:pPr>
         <w:pStyle w:val="Bibliography"/>
@@ -9408,11 +9497,11 @@
         <w:t xml:space="preserve"> </w:t>
       </w:r>
       <w:r>
-        <w:t xml:space="preserve">89(5): 1195–1211.</w:t>
-      </w:r>
-    </w:p>
-    <w:bookmarkEnd w:id="67"/>
-    <w:bookmarkStart w:id="68" w:name="X012e76b31d5d5dc04bc07e28072074c013120fb"/>
+        <w:t xml:space="preserve">89(5): 1195–1211. http://onlinelibrary.wiley.com/doi/10.1111/j.1540-6237.2008.00565.x/abstract (February 10, 2012).</w:t>
+      </w:r>
+    </w:p>
+    <w:bookmarkEnd w:id="68"/>
+    <w:bookmarkStart w:id="69" w:name="X012e76b31d5d5dc04bc07e28072074c013120fb"/>
     <w:p>
       <w:pPr>
         <w:pStyle w:val="Bibliography"/>
@@ -9470,11 +9559,11 @@
         <w:t xml:space="preserve"> </w:t>
       </w:r>
       <w:r>
-        <w:t xml:space="preserve">18(2): 024002.</w:t>
-      </w:r>
-    </w:p>
-    <w:bookmarkEnd w:id="68"/>
-    <w:bookmarkStart w:id="69" w:name="ref-mcbethPoliticalIdeologyNuclear2023a"/>
+        <w:t xml:space="preserve">18(2): 024002. https://doi.org/10.1088/1748-9326/acaf3c (June 25, 2026).</w:t>
+      </w:r>
+    </w:p>
+    <w:bookmarkEnd w:id="69"/>
+    <w:bookmarkStart w:id="70" w:name="ref-mcbethPoliticalIdeologyNuclear2023a"/>
     <w:p>
       <w:pPr>
         <w:pStyle w:val="Bibliography"/>
@@ -9550,11 +9639,11 @@
         <w:t xml:space="preserve"> </w:t>
       </w:r>
       <w:r>
-        <w:t xml:space="preserve">40(1): 88–118.</w:t>
-      </w:r>
-    </w:p>
-    <w:bookmarkEnd w:id="69"/>
-    <w:bookmarkStart w:id="70" w:name="Xfaeef3ee7dea4a33ed34a32a7472cd4613d38dd"/>
+        <w:t xml:space="preserve">40(1): 88–118. https://onlinelibrary.wiley.com/doi/abs/10.1111/ropr.12489 (July 14, 2023).</w:t>
+      </w:r>
+    </w:p>
+    <w:bookmarkEnd w:id="70"/>
+    <w:bookmarkStart w:id="71" w:name="Xfaeef3ee7dea4a33ed34a32a7472cd4613d38dd"/>
     <w:p>
       <w:pPr>
         <w:pStyle w:val="Bibliography"/>
@@ -9651,8 +9740,8 @@
         <w:t xml:space="preserve">52(2): 155–94.</w:t>
       </w:r>
     </w:p>
-    <w:bookmarkEnd w:id="70"/>
-    <w:bookmarkStart w:id="71" w:name="X61f9dc53d23f395f6b55ebe787087b280b52f47"/>
+    <w:bookmarkEnd w:id="71"/>
+    <w:bookmarkStart w:id="72" w:name="X61f9dc53d23f395f6b55ebe787087b280b52f47"/>
     <w:p>
       <w:pPr>
         <w:pStyle w:val="Bibliography"/>
@@ -9718,8 +9807,8 @@
         <w:t xml:space="preserve">https://abcnews.com/Business/wireStory/trump-administration-announces-175-billion-loans-10-new-134137821 (June 25, 2026).</w:t>
       </w:r>
     </w:p>
-    <w:bookmarkEnd w:id="71"/>
-    <w:bookmarkStart w:id="72" w:name="ref-merkleyPartyCuesNews2021"/>
+    <w:bookmarkEnd w:id="72"/>
+    <w:bookmarkStart w:id="73" w:name="ref-merkleyPartyCuesNews2021"/>
     <w:p>
       <w:pPr>
         <w:pStyle w:val="Bibliography"/>
@@ -9807,11 +9896,11 @@
         <w:t xml:space="preserve"> </w:t>
       </w:r>
       <w:r>
-        <w:t xml:space="preserve">51(4): 1439–56.</w:t>
-      </w:r>
-    </w:p>
-    <w:bookmarkEnd w:id="72"/>
-    <w:bookmarkStart w:id="73" w:name="ref-nicholsonPolarizingCues2012"/>
+        <w:t xml:space="preserve">51(4): 1439–56. https://www.cambridge.org/core/journals/british-journal-of-political-science/article/party-cues-in-the-news-democratic-elites-republican-backlash-and-the-dynamics-of-climate-skepticism/9B173B1C904EC70361BBBF51C456A343 (May 19, 2023).</w:t>
+      </w:r>
+    </w:p>
+    <w:bookmarkEnd w:id="73"/>
+    <w:bookmarkStart w:id="74" w:name="ref-nicholsonPolarizingCues2012"/>
     <w:p>
       <w:pPr>
         <w:pStyle w:val="Bibliography"/>
@@ -9851,8 +9940,8 @@
         <w:t xml:space="preserve">56(1): 52–66.</w:t>
       </w:r>
     </w:p>
-    <w:bookmarkEnd w:id="73"/>
-    <w:bookmarkStart w:id="74" w:name="X0aeaf6b854948b2cdf0296f02791eebffa60678"/>
+    <w:bookmarkEnd w:id="74"/>
+    <w:bookmarkStart w:id="75" w:name="X0aeaf6b854948b2cdf0296f02791eebffa60678"/>
     <w:p>
       <w:pPr>
         <w:pStyle w:val="Bibliography"/>
@@ -9916,8 +10005,8 @@
         <w:t xml:space="preserve">64: 101441.</w:t>
       </w:r>
     </w:p>
-    <w:bookmarkEnd w:id="74"/>
-    <w:bookmarkStart w:id="75" w:name="ref-seversonMoralFramesClimate2015"/>
+    <w:bookmarkEnd w:id="75"/>
+    <w:bookmarkStart w:id="76" w:name="ref-seversonMoralFramesClimate2015"/>
     <w:p>
       <w:pPr>
         <w:pStyle w:val="Bibliography"/>
@@ -9969,8 +10058,8 @@
         <w:t xml:space="preserve">96(5): 1277–90.</w:t>
       </w:r>
     </w:p>
-    <w:bookmarkEnd w:id="75"/>
-    <w:bookmarkStart w:id="76" w:name="Xa5c9f92c1fac0e0da55511beef719999fab450a"/>
+    <w:bookmarkEnd w:id="76"/>
+    <w:bookmarkStart w:id="77" w:name="Xa5c9f92c1fac0e0da55511beef719999fab450a"/>
     <w:p>
       <w:pPr>
         <w:pStyle w:val="Bibliography"/>
@@ -10031,11 +10120,11 @@
         <w:t xml:space="preserve"> </w:t>
       </w:r>
       <w:r>
-        <w:t xml:space="preserve">3(1): 2.</w:t>
-      </w:r>
-    </w:p>
-    <w:bookmarkEnd w:id="76"/>
-    <w:bookmarkStart w:id="77" w:name="ref-stokesRenewableEnergyPolicy2017"/>
+        <w:t xml:space="preserve">3(1): 2. https://www.nature.com/articles/s44168-023-00074-1 (May 11, 2026).</w:t>
+      </w:r>
+    </w:p>
+    <w:bookmarkEnd w:id="77"/>
+    <w:bookmarkStart w:id="78" w:name="ref-stokesRenewableEnergyPolicy2017"/>
     <w:p>
       <w:pPr>
         <w:pStyle w:val="Bibliography"/>
@@ -10096,11 +10185,11 @@
         <w:t xml:space="preserve"> </w:t>
       </w:r>
       <w:r>
-        <w:t xml:space="preserve">2(8, 8): 1–6.</w:t>
-      </w:r>
-    </w:p>
-    <w:bookmarkEnd w:id="77"/>
-    <w:bookmarkStart w:id="78" w:name="ref-taylorTrumpEffectImmigration2026"/>
+        <w:t xml:space="preserve">2(8, 8): 1–6. https://www.nature.com/articles/nenergy2017107 (May 26, 2020).</w:t>
+      </w:r>
+    </w:p>
+    <w:bookmarkEnd w:id="78"/>
+    <w:bookmarkStart w:id="79" w:name="ref-taylorTrumpEffectImmigration2026"/>
     <w:p>
       <w:pPr>
         <w:pStyle w:val="Bibliography"/>
@@ -10158,11 +10247,11 @@
         <w:t xml:space="preserve"> </w:t>
       </w:r>
       <w:r>
-        <w:t xml:space="preserve">46(1): 102–25.</w:t>
-      </w:r>
-    </w:p>
-    <w:bookmarkEnd w:id="78"/>
-    <w:bookmarkStart w:id="79" w:name="Xd384249e3706c84f9e93bae331eedd62bafe528"/>
+        <w:t xml:space="preserve">46(1): 102–25. https://www.cambridge.org/core/journals/journal-of-public-policy/article/trump-effect-on-immigration-policy-attitudes-another-look/A14BFB0A8AACAC9DC4700BD5175CFD8B (December 19, 2025).</w:t>
+      </w:r>
+    </w:p>
+    <w:bookmarkEnd w:id="79"/>
+    <w:bookmarkStart w:id="80" w:name="Xd384249e3706c84f9e93bae331eedd62bafe528"/>
     <w:p>
       <w:pPr>
         <w:pStyle w:val="Bibliography"/>
@@ -10256,11 +10345,11 @@
         <w:t xml:space="preserve"> </w:t>
       </w:r>
       <w:r>
-        <w:t xml:space="preserve">Forthcoming: e70121.</w:t>
-      </w:r>
-    </w:p>
-    <w:bookmarkEnd w:id="79"/>
-    <w:bookmarkStart w:id="80" w:name="Xbcbd837b5b220bdd8209fd24f768be396961b6f"/>
+        <w:t xml:space="preserve">Forthcoming: e70121. https://onlinelibrary.wiley.com/doi/abs/10.1111/psj.70121 (June 10, 2026).</w:t>
+      </w:r>
+    </w:p>
+    <w:bookmarkEnd w:id="80"/>
+    <w:bookmarkStart w:id="81" w:name="Xbcbd837b5b220bdd8209fd24f768be396961b6f"/>
     <w:p>
       <w:pPr>
         <w:pStyle w:val="Bibliography"/>
@@ -10330,11 +10419,11 @@
         <w:t xml:space="preserve"> </w:t>
       </w:r>
       <w:r>
-        <w:t xml:space="preserve">91: 102759.</w:t>
-      </w:r>
-    </w:p>
-    <w:bookmarkEnd w:id="80"/>
-    <w:bookmarkStart w:id="81" w:name="ref-whitmarshToolsNewClimate2017"/>
+        <w:t xml:space="preserve">91: 102759. https://www.sciencedirect.com/science/article/pii/S2214629622002626 (August 12, 2022).</w:t>
+      </w:r>
+    </w:p>
+    <w:bookmarkEnd w:id="81"/>
+    <w:bookmarkStart w:id="82" w:name="ref-whitmarshToolsNewClimate2017"/>
     <w:p>
       <w:pPr>
         <w:pStyle w:val="Bibliography"/>
@@ -10416,11 +10505,11 @@
         <w:t xml:space="preserve"> </w:t>
       </w:r>
       <w:r>
-        <w:t xml:space="preserve">42: 122–35.</w:t>
-      </w:r>
-    </w:p>
-    <w:bookmarkEnd w:id="81"/>
-    <w:bookmarkStart w:id="82" w:name="ref-yeoPartisanAmplificationRisk2014"/>
+        <w:t xml:space="preserve">42: 122–35. http://www.sciencedirect.com/science/article/pii/S0959378016306318 (March 3, 2017).</w:t>
+      </w:r>
+    </w:p>
+    <w:bookmarkEnd w:id="82"/>
+    <w:bookmarkStart w:id="83" w:name="ref-yeoPartisanAmplificationRisk2014"/>
     <w:p>
       <w:pPr>
         <w:pStyle w:val="Bibliography"/>
@@ -10514,11 +10603,11 @@
         <w:t xml:space="preserve"> </w:t>
       </w:r>
       <w:r>
-        <w:t xml:space="preserve">67: 727–36.</w:t>
-      </w:r>
-    </w:p>
-    <w:bookmarkEnd w:id="82"/>
-    <w:bookmarkStart w:id="83" w:name="ref-zhouBoomerangsJavelinsHow2016"/>
+        <w:t xml:space="preserve">67: 727–36. https://linkinghub.elsevier.com/retrieve/pii/S0301421513011919 (June 10, 2026).</w:t>
+      </w:r>
+    </w:p>
+    <w:bookmarkEnd w:id="83"/>
+    <w:bookmarkStart w:id="84" w:name="ref-zhouBoomerangsJavelinsHow2016"/>
     <w:p>
       <w:pPr>
         <w:pStyle w:val="Bibliography"/>
@@ -10579,9 +10668,9 @@
         <w:t xml:space="preserve">25(5): 788–811.</w:t>
       </w:r>
     </w:p>
-    <w:bookmarkEnd w:id="83"/>
     <w:bookmarkEnd w:id="84"/>
     <w:bookmarkEnd w:id="85"/>
+    <w:bookmarkEnd w:id="86"/>
     <w:sectPr>
       <w:footnotePr>
         <w:numRestart w:val="eachSect"/>

</xml_diff>